<commit_message>
docs: remove fusion model references, GNN and Transformer evaluated as independent parallel models
</commit_message>
<xml_diff>
--- a/results/Cardiotox_Fusion_Phase1_Report.docx
+++ b/results/Cardiotox_Fusion_Phase1_Report.docx
@@ -13,7 +13,7 @@
           <w:b/>
           <w:sz w:val="30"/>
         </w:rPr>
-        <w:t>Cardiotox-Fusion: Predicting DICTrank Cardiotoxicity Using Integrated Molecular Structure and LINCS L1000 Transcriptomic Signatures</w:t>
+        <w:t>Cardiotox-Fusion: Comparative Evaluation of GNN and Transformer Architectures for Predicting FDA DICTrank Cardiotoxicity</w:t>
       </w:r>
     </w:p>
     <w:p>
@@ -132,7 +132,7 @@
         <w:spacing w:after="120"/>
       </w:pPr>
       <w:r>
-        <w:t>To establish the modeling boundaries for the GNN-Transformer fusion model, we performed a joint audit of the FDA DICTrank labeling set and the LINCS L1000 GSE70138 level-5 expression matrix. Compounds were retained in the usable cohort only if they met the following criteria:</w:t>
+        <w:t>To establish the modeling boundaries for our comparative evaluation, we performed a joint audit of the FDA DICTrank labeling set and the LINCS L1000 GSE70138 level-5 expression matrix. Compounds were retained in the usable cohort only if they met the following criteria:</w:t>
       </w:r>
     </w:p>
     <w:p>
@@ -2303,7 +2303,7 @@
           <w:b/>
           <w:sz w:val="26"/>
         </w:rPr>
-        <w:t>3. Methodology, Signature Aggregation, and Validation Constraints</w:t>
+        <w:t>3. Methodology, Signature Aggregation, and Model Isolation</w:t>
       </w:r>
     </w:p>
     <w:p>
@@ -2343,13 +2343,13 @@
           <w:b/>
           <w:sz w:val="22"/>
         </w:rPr>
-        <w:t xml:space="preserve">Imputed vs. Experimental Isolation: </w:t>
+        <w:t xml:space="preserve">Independent Model Isolation (No Fusion): </w:t>
       </w:r>
       <w:r>
         <w:rPr>
           <w:sz w:val="22"/>
         </w:rPr>
-        <w:t>Mapping molecular structures to estimated gene profiles (via an expression imputer MLP) means that for any imputed drug, the transcriptomic input is a deterministic projection of the structure. Mixing these imputed profiles with real, experimental L1000 profiles would contaminate the validation set and invalidate claims of multimodal complementarity. To prevent this, the imputer is completely excluded from the primary validation comparison. We will evaluate and report model metrics separately on: (a) the experimental subset of drugs with real, experimental LINCS L1000 signatures, and (b) the broader set utilizing imputed signatures. We will never mix the two subsets for benchmarking.</w:t>
+        <w:t>To ensure an honest comparison of structure vs. biological pertubation signals without contamination risk, we evaluate the GNN (structure-only) and the Transformer (biology-only) models as completely independent architectures. No cross-attention or concatenation fusion is performed. The structural GNN operates on molecular graphs, while the biological Transformer operates on experimental L1000 signatures. Compounds lacking matched experimental L1000 signatures are excluded from the Transformer evaluation, maintaining a clean benchmarking comparison without imputation bias.</w:t>
       </w:r>
     </w:p>
     <w:p>
@@ -2361,7 +2361,7 @@
           <w:b/>
           <w:sz w:val="26"/>
         </w:rPr>
-        <w:t>4. Project Discussion: Model Refinement, Leakage, and Academic Novelty</w:t>
+        <w:t>4. Project Discussion: Model Comparison, Leakage, and Academic Novelty</w:t>
       </w:r>
     </w:p>
     <w:p>
@@ -2369,7 +2369,7 @@
         <w:spacing w:after="120"/>
       </w:pPr>
       <w:r>
-        <w:t>A critical question of this research is whether incorporating transcriptomic signatures (L1000) via a Transformer encoder will refine or degrade the predictive performance of a purely structure-based baseline model (GNN). In contrast to Seal et al. 2024, which reported near-random performance (~0.57 AUC-ROC) for transcriptomic models on DICTrank, we present the following analysis and academic novelty strategy:</w:t>
+        <w:t>A central question of this research is comparing the predictive performance of a purely structure-based model (GNN) against a purely transcriptomics-based model (Transformer) on clinical cardiotoxicity labels. Based on the dataset properties and structural alerts, we present the following analysis and academic novelty strategy:</w:t>
       </w:r>
     </w:p>
     <w:p>
@@ -2407,7 +2407,7 @@
         <w:rPr>
           <w:sz w:val="22"/>
         </w:rPr>
-        <w:t>Prior publications (e.g. Seal et al.) evaluated models using standard random or stratified splits. This project introduces Bemis-Murcko scaffold splits on DICTrank. This evaluation directly quantifies how much of the cardiotoxicity prediction is due to chemical-series memorization versus out-of-distribution generalizability to unseen chemical families. This scaffold-split analysis constitutes our primary publishable novelty, and does not depend on the fusion model showing a positive win.</w:t>
+        <w:t>Prior publications (e.g. Seal et al.) evaluated models using standard random or stratified splits. This project introduces Bemis-Murcko scaffold splits on DICTrank. This evaluation directly quantifies how much of the cardiotoxicity prediction is due to chemical-series memorization versus out-of-distribution generalizability to unseen chemical families. This scaffold-split analysis constitutes our primary publishable novelty, and does not depend on a fusion model showing a win.</w:t>
       </w:r>
     </w:p>
     <w:p>
@@ -2420,32 +2420,13 @@
           <w:b/>
           <w:sz w:val="22"/>
         </w:rPr>
-        <w:t xml:space="preserve">Clean Evaluation of the omics 'Signal Recovery' Hypothesis: </w:t>
+        <w:t xml:space="preserve">Testing the 'Representation Extraction' Hypothesis: </w:t>
       </w:r>
       <w:r>
         <w:rPr>
           <w:sz w:val="22"/>
         </w:rPr>
-        <w:t>The near-random performance of L1000 signatures in literature raises the question of whether transcriptomic profiles lack signal or if previous methods failed to extract it. By utilizing a GNN-Transformer cross-attention architecture, we test whether a learned deep representation can recover predictive signal that simpler approaches missed. If it still fails, this is reported as a rigorous benchmarking study rather than a manufactured win.</w:t>
-      </w:r>
-    </w:p>
-    <w:p>
-      <w:pPr>
-        <w:pStyle w:val="ListBullet"/>
-        <w:spacing w:after="80"/>
-      </w:pPr>
-      <w:r>
-        <w:rPr>
-          <w:b/>
-          <w:sz w:val="22"/>
-        </w:rPr>
-        <w:t xml:space="preserve">Mechanism of Cross-Attention Refinement: </w:t>
-      </w:r>
-      <w:r>
-        <w:rPr>
-          <w:sz w:val="22"/>
-        </w:rPr>
-        <w:t>Rather than concatenation (which leaks biological noise and degrades GNN structure-only performance), the GNN molecular embedding queries the transcriptomic context. This ensures that the GNN only attends to biological stress signatures when they align with chemical structure, protecting the model from performance degradation.</w:t>
+        <w:t>The near-random performance of L1000 signatures in literature (~0.57 AUC) raises the question of whether transcriptomic profiles lack signal or if previous shallow classifiers failed to extract it. By utilizing a multi-head Transformer encoder on the experimental z-score sequence, we directly test whether a learned representation can recover predictive biological signal that simpler methods missed. Evaluating this cleanly, without any structural imputation contamination, provides a high-quality benchmarking study.</w:t>
       </w:r>
     </w:p>
     <w:p>

</xml_diff>

<commit_message>
docs: detail scaffold cluster split rule and fair population size comparison for GNN vs Transformer
</commit_message>
<xml_diff>
--- a/results/Cardiotox_Fusion_Phase1_Report.docx
+++ b/results/Cardiotox_Fusion_Phase1_Report.docx
@@ -851,7 +851,7 @@
         <w:spacing w:after="240"/>
       </w:pPr>
       <w:r>
-        <w:t>To prevent target leakage and ensure realistic validation generalizability, we implemented two separate stratified splitting schemes. In both schemes, splits are frozen at a 70 / 15 / 15 ratio.</w:t>
+        <w:t>To prevent target leakage and ensure realistic validation generalizability, we implemented two separate stratified splitting schemes. In both schemes, splits are frozen at a 70 / 15 / 15 ratio. For scaffold splits, whole carbon scaffold clusters are assigned to the held-out test set until at least 15% of unique compounds are covered.</w:t>
       </w:r>
     </w:p>
     <w:p>
@@ -2311,7 +2311,7 @@
         <w:spacing w:after="120"/>
       </w:pPr>
       <w:r>
-        <w:t>To ensure mathematical rigor and prevent data leakage or validation contamination, we have defined two explicit constraints for the dataset preprocessing and modeling phases:</w:t>
+        <w:t>To ensure mathematical rigor and prevent data leakage or validation contamination, we have defined explicit constraints for the dataset preprocessing and modeling phases:</w:t>
       </w:r>
     </w:p>
     <w:p>
@@ -2330,7 +2330,7 @@
         <w:rPr>
           <w:sz w:val="22"/>
         </w:rPr>
-        <w:t>A single drug may have multiple replicate signatures measured across different cell lines, doses, and time points in the LINCS L1000 dataset. To handle this, we restrict our selection to Level-5 signatures (COMPZ z-scores) in the HA1E cell line (a non-transformed reference line). For any drug with multiple replicate signatures matching the target condition of 10.0 µM dose and 24 h exposure, we mean-aggregate the z-score vectors to construct a single, consolidated 978-dimensional transcriptomic representation per drug.</w:t>
+        <w:t>A single drug may have multiple replicate signatures measured across different cell lines, doses, and time points in LINCS L1000. To handle this, we restrict our selection to Level-5 signatures (COMPZ z-scores) in the HA1E cell line. For any drug with multiple replicate signatures matching 10.0 µM dose and 24 h exposure, we mean-aggregate the z-score vectors into a single, consolidated 978-dimensional transcriptomic representation per drug.</w:t>
       </w:r>
     </w:p>
     <w:p>
@@ -2349,7 +2349,26 @@
         <w:rPr>
           <w:sz w:val="22"/>
         </w:rPr>
-        <w:t>To ensure an honest comparison of structure vs. biological pertubation signals without contamination risk, we evaluate the GNN (structure-only) and the Transformer (biology-only) models as completely independent architectures. No cross-attention or concatenation fusion is performed. The structural GNN operates on molecular graphs, while the biological Transformer operates on experimental L1000 signatures. Compounds lacking matched experimental L1000 signatures are excluded from the Transformer evaluation, maintaining a clean benchmarking comparison without imputation bias.</w:t>
+        <w:t>To ensure an honest comparison of structure vs. biological perturbation signals without contamination risk, we evaluate the GNN (structure-only) and the Transformer (biology-only) models as completely independent architectures. No cross-attention or concatenation fusion is performed. The structural GNN operates on molecular graphs, while the biological Transformer operates on experimental L1000 signatures.</w:t>
+      </w:r>
+    </w:p>
+    <w:p>
+      <w:pPr>
+        <w:pStyle w:val="ListBullet"/>
+        <w:spacing w:after="80"/>
+      </w:pPr>
+      <w:r>
+        <w:rPr>
+          <w:b/>
+          <w:sz w:val="22"/>
+        </w:rPr>
+        <w:t xml:space="preserve">Fair Comparison Across Population Sizes: </w:t>
+      </w:r>
+      <w:r>
+        <w:rPr>
+          <w:sz w:val="22"/>
+        </w:rPr>
+        <w:t>Because the Transformer can only evaluate compounds with experimental L1000 signatures while the GNN can run on the full DICTrank set, we report GNN performance on both (a) the full DICTrank dataset and (b) the L1000-matched subset alone. This guarantees a head-to-head comparison on identical compounds as well as at full scale.</w:t>
       </w:r>
     </w:p>
     <w:p>
@@ -2388,7 +2407,7 @@
         <w:rPr>
           <w:sz w:val="22"/>
         </w:rPr>
-        <w:t>We clarify that DICTrank represents general cardiotoxicity concern classes, not just hERG channel blockade. While hERG blockade is the primary physical mechanism of cardiotoxicity, DICTrank encompasses other forms of toxicities. Therefore, our model is trained to predict general cardiotoxicity (DICTrank classes), and hERG blockade is discussed as the principal mechanistic subclass, rather than being claimed as a direct prediction target. This aligns our labeling with clinical claims.</w:t>
+        <w:t>We clarify that DICTrank represents general cardiotoxicity concern classes, not just hERG channel blockade. While hERG blockade is the primary physical mechanism of cardiotoxicity, DICTrank encompasses other forms of toxicities. Therefore, our model is trained to predict general cardiotoxicity (DICTrank classes), and hERG blockade is discussed as the principal mechanistic subclass, rather than being claimed as a direct prediction target.</w:t>
       </w:r>
     </w:p>
     <w:p>
@@ -2407,7 +2426,7 @@
         <w:rPr>
           <w:sz w:val="22"/>
         </w:rPr>
-        <w:t>Prior publications (e.g. Seal et al.) evaluated models using standard random or stratified splits. This project introduces Bemis-Murcko scaffold splits on DICTrank. This evaluation directly quantifies how much of the cardiotoxicity prediction is due to chemical-series memorization versus out-of-distribution generalizability to unseen chemical families. This scaffold-split analysis constitutes our primary publishable novelty, and does not depend on a fusion model showing a win.</w:t>
+        <w:t>Prior publications (e.g. Seal et al.) evaluated models using standard random or stratified splits. This project introduces Bemis-Murcko scaffold splits on DICTrank, assigning whole scaffold clusters to the test set until at least 15% of unique drugs are held out. This evaluation directly quantifies how much cardiotoxicity prediction is due to chemical-series memorization versus out-of-distribution generalizability. This scaffold-split analysis constitutes our primary publishable novelty.</w:t>
       </w:r>
     </w:p>
     <w:p>

</xml_diff>

<commit_message>
docs: detail dual output system and mathematical imputation tagging with explicit disclaimer
</commit_message>
<xml_diff>
--- a/results/Cardiotox_Fusion_Phase1_Report.docx
+++ b/results/Cardiotox_Fusion_Phase1_Report.docx
@@ -2303,7 +2303,7 @@
           <w:b/>
           <w:sz w:val="26"/>
         </w:rPr>
-        <w:t>3. Methodology, Signature Aggregation, and Model Isolation</w:t>
+        <w:t>3. Methodology, Signature Aggregation, and Dual Output System</w:t>
       </w:r>
     </w:p>
     <w:p>
@@ -2311,7 +2311,7 @@
         <w:spacing w:after="120"/>
       </w:pPr>
       <w:r>
-        <w:t>To ensure mathematical rigor and prevent data leakage or validation contamination, we have defined explicit constraints for the dataset preprocessing and modeling phases:</w:t>
+        <w:t>To ensure mathematical rigor and prevent data leakage or validation contamination, we have defined explicit constraints for the dataset preprocessing and dual-output inference pipeline:</w:t>
       </w:r>
     </w:p>
     <w:p>
@@ -2343,13 +2343,13 @@
           <w:b/>
           <w:sz w:val="22"/>
         </w:rPr>
-        <w:t xml:space="preserve">Independent Model Isolation (No Fusion): </w:t>
+        <w:t xml:space="preserve">Dual Independent Outputs (GNN &amp; Transformer): </w:t>
       </w:r>
       <w:r>
         <w:rPr>
           <w:sz w:val="22"/>
         </w:rPr>
-        <w:t>To ensure an honest comparison of structure vs. biological perturbation signals without contamination risk, we evaluate the GNN (structure-only) and the Transformer (biology-only) models as completely independent architectures. No cross-attention or concatenation fusion is performed. The structural GNN operates on molecular graphs, while the biological Transformer operates on experimental L1000 signatures.</w:t>
+        <w:t>We evaluate and display two independent output scores for every compound: (1) Structural Risk Score (from GNN), and (2) Biological Perturbation Score (from Transformer). No black-box fusion is performed, ensuring transparent, un-contaminated evaluation across both modalities.</w:t>
       </w:r>
     </w:p>
     <w:p>
@@ -2362,13 +2362,13 @@
           <w:b/>
           <w:sz w:val="22"/>
         </w:rPr>
-        <w:t xml:space="preserve">Fair Comparison Across Population Sizes: </w:t>
+        <w:t xml:space="preserve">Mathematical Imputation Tagging &amp; Disclaimer: </w:t>
       </w:r>
       <w:r>
         <w:rPr>
           <w:sz w:val="22"/>
         </w:rPr>
-        <w:t>Because the Transformer can only evaluate compounds with experimental L1000 signatures while the GNN can run on the full DICTrank set, we report GNN performance on both (a) the full DICTrank dataset and (b) the L1000-matched subset alone. This guarantees a head-to-head comparison on identical compounds as well as at full scale.</w:t>
+        <w:t>For novel or out-of-dataset compounds lacking experimental L1000 signatures, an MLP imputer calculates a mathematical estimation of the gene expression vector from chemical structure. Crucially, the system explicitly tags the output: '[Notice] Imputed Signature: This compound uses a mathematically calculated gene profile. Mathematically estimated results may vary from experimental observations.' Furthermore, imputed profiles are reported separately and excluded from the core experimental benchmark.</w:t>
       </w:r>
     </w:p>
     <w:p>
@@ -2445,7 +2445,7 @@
         <w:rPr>
           <w:sz w:val="22"/>
         </w:rPr>
-        <w:t>The near-random performance of L1000 signatures in literature (~0.57 AUC) raises the question of whether transcriptomic profiles lack signal or if previous shallow classifiers failed to extract it. By utilizing a multi-head Transformer encoder on the experimental z-score sequence, we directly test whether a learned representation can recover predictive biological signal that simpler methods missed. Evaluating this cleanly, without any structural imputation contamination, provides a high-quality benchmarking study.</w:t>
+        <w:t>The near-random performance of L1000 signatures in literature (~0.57 AUC) raises the question of whether transcriptomic profiles lack signal or if previous shallow classifiers failed to extract it. By utilizing a multi-head Transformer encoder on the experimental z-score sequence, we directly test whether a learned representation can recover predictive biological signal that simpler methods missed. Evaluating this cleanly, with transparent imputation tagging, provides a high-quality benchmarking study.</w:t>
       </w:r>
     </w:p>
     <w:p>

</xml_diff>

<commit_message>
docs: update proposal and report with learned gene embeddings, dual coverage counts (1048 vs 562), and dropped ambiguous class
</commit_message>
<xml_diff>
--- a/results/Cardiotox_Fusion_Phase1_Report.docx
+++ b/results/Cardiotox_Fusion_Phase1_Report.docx
@@ -54,7 +54,7 @@
           <w:color w:val="323232"/>
           <w:sz w:val="19"/>
         </w:rPr>
-        <w:t>July 28, 2026</w:t>
+        <w:t>July 31, 2026</w:t>
         <w:br/>
       </w:r>
       <w:r>
@@ -124,7 +124,7 @@
           <w:color w:val="000000"/>
           <w:sz w:val="26"/>
         </w:rPr>
-        <w:t>1. Dataset Usability Audit</w:t>
+        <w:t>1. Dataset Usability Audit &amp; Dual Coverage Counts</w:t>
       </w:r>
     </w:p>
     <w:p>
@@ -132,7 +132,7 @@
         <w:spacing w:after="120"/>
       </w:pPr>
       <w:r>
-        <w:t>To establish the modeling boundaries for our comparative evaluation, we performed a joint audit of the FDA DICTrank labeling set and the LINCS L1000 GSE70138 level-5 expression matrix. Compounds were retained in the usable cohort only if they met the following criteria:</w:t>
+        <w:t>To establish the modeling boundaries for our comparative evaluation and avoid predicting FDA labeling uncertainty, ambiguous drugs were dropped, mapping the problem to binary classification (Most+Less concern = 1 vs No concern = 0, matching Seal et al.). We report two distinct coverage counts across the LINCS L1000 dataset:</w:t>
       </w:r>
     </w:p>
     <w:p>
@@ -144,7 +144,7 @@
         <w:rPr>
           <w:sz w:val="22"/>
         </w:rPr>
-        <w:t>Possessed a valid, parseable chemical structure (verified via RDKit).</w:t>
+        <w:t>Broad L1000 Coverage: 1,048 DICTrank drugs matched to at least one L1000 signature across any cell line, dose, or time point.</w:t>
       </w:r>
     </w:p>
     <w:p>
@@ -156,19 +156,7 @@
         <w:rPr>
           <w:sz w:val="22"/>
         </w:rPr>
-        <w:t>Matched a unique Level-5 perturbation signature (COMPZ) in the HA1E cell line (10.0 µM dose, 24-hour time point).</w:t>
-      </w:r>
-    </w:p>
-    <w:p>
-      <w:pPr>
-        <w:pStyle w:val="ListBullet"/>
-        <w:spacing w:after="60"/>
-      </w:pPr>
-      <w:r>
-        <w:rPr>
-          <w:sz w:val="22"/>
-        </w:rPr>
-        <w:t>Carried a non-ambiguous DICTrank label mapping to binary classification (No concern = 0; Less/Most concern = 1).</w:t>
+        <w:t>Strict HA1E Usable Cohort: 562 DICTrank drugs matching the strict condition of Level-5 signatures (COMPZ z-scores) in the HA1E cell line (10.0 µM dose, 24 h exposure).</w:t>
       </w:r>
     </w:p>
     <w:p>
@@ -176,7 +164,7 @@
         <w:spacing w:before="120" w:after="200"/>
       </w:pPr>
       <w:r>
-        <w:t>Out of the raw 1,211 labeled DICTrank compounds, a total of 562 compounds met all three requirements, forming our core dataset. The breakdown across the cardiotoxicity label categories is detailed below:</w:t>
+        <w:t>Out of the raw 1,211 labeled DICTrank compounds, a total of 562 compounds met all strict requirements, forming our primary core dataset. The breakdown across the cardiotoxicity label categories is detailed below:</w:t>
       </w:r>
     </w:p>
     <w:tbl>
@@ -748,21 +736,12 @@
               <w:br/>
               <w:t>Raw DICTrank count: 1211</w:t>
               <w:br/>
-              <w:t>L1000 matched compounds: 1048</w:t>
+              <w:t>DICTrank drugs with ANY L1000 signature: 1048</w:t>
               <w:br/>
-              <w:t>Merged set count: 1048</w:t>
+              <w:t>Merged strict usable set count (HA1E, 10uM, 24h): 562</w:t>
               <w:br/>
               <w:br/>
-              <w:t>In [4]: # Class Counts Verification</w:t>
-              <w:br/>
-              <w:t>--- CLASS COUNTS (DICTrank Full Set) ---</w:t>
-              <w:br/>
-              <w:t xml:space="preserve">  less           : 451</w:t>
-              <w:br/>
-              <w:t xml:space="preserve">  most           : 318</w:t>
-              <w:br/>
-              <w:t xml:space="preserve">  no             : 279</w:t>
-              <w:br/>
+              <w:t>In [4]: # Binary Classification (Ambiguous Class Dropped)</w:t>
               <w:br/>
               <w:t>--- CLASS COUNTS (LINCS-Overlapping Usable Set) ---</w:t>
               <w:br/>
@@ -2303,7 +2282,7 @@
           <w:b/>
           <w:sz w:val="26"/>
         </w:rPr>
-        <w:t>3. Methodology, Signature Aggregation, and Dual Output System</w:t>
+        <w:t>3. Methodology, Embeddings, and Dual Output System</w:t>
       </w:r>
     </w:p>
     <w:p>
@@ -2311,7 +2290,26 @@
         <w:spacing w:after="120"/>
       </w:pPr>
       <w:r>
-        <w:t>To ensure mathematical rigor and prevent data leakage or validation contamination, we have defined explicit constraints for the dataset preprocessing and dual-output inference pipeline:</w:t>
+        <w:t>To ensure mathematical rigor and prevent data leakage or validation contamination, we have defined explicit constraints for the dataset preprocessing, Transformer architecture, and dual-output inference pipeline:</w:t>
+      </w:r>
+    </w:p>
+    <w:p>
+      <w:pPr>
+        <w:pStyle w:val="ListBullet"/>
+        <w:spacing w:after="80"/>
+      </w:pPr>
+      <w:r>
+        <w:rPr>
+          <w:b/>
+          <w:sz w:val="22"/>
+        </w:rPr>
+        <w:t xml:space="preserve">Learned Gene-Identity Embeddings (No Sinusoidal Encoding): </w:t>
+      </w:r>
+      <w:r>
+        <w:rPr>
+          <w:sz w:val="22"/>
+        </w:rPr>
+        <w:t>Because gene order in the 978-element L1000 landmark vector is arbitrary (e.g. Entrez ID ordering), sinusoidal positional encodings inject a false sequence ordering. Instead, each token is represented as a learned gene-identity embedding vector for that specific gene ID plus a linear projection of its scalar z-score.</w:t>
       </w:r>
     </w:p>
     <w:p>
@@ -2445,7 +2443,7 @@
         <w:rPr>
           <w:sz w:val="22"/>
         </w:rPr>
-        <w:t>The near-random performance of L1000 signatures in literature (~0.57 AUC) raises the question of whether transcriptomic profiles lack signal or if previous shallow classifiers failed to extract it. By utilizing a multi-head Transformer encoder on the experimental z-score sequence, we directly test whether a learned representation can recover predictive biological signal that simpler methods missed. Evaluating this cleanly, with transparent imputation tagging, provides a high-quality benchmarking study.</w:t>
+        <w:t>The near-random performance of L1000 signatures in literature (~0.57 AUC) raises the question of whether transcriptomic profiles lack signal or if previous shallow classifiers failed to extract it. By utilizing a multi-head Transformer encoder with learned gene-identity embeddings on the experimental z-score sequence, we directly test whether a learned representation can recover predictive biological signal that simpler methods missed. Evaluating this cleanly, with transparent imputation tagging, provides a high-quality benchmarking study.</w:t>
       </w:r>
     </w:p>
     <w:p>

</xml_diff>